<commit_message>
chore: batch commit all local changes (H1-H10/I1-I2/G8-G14/A17/B60/D3 enhancements + tests + templates)
</commit_message>
<xml_diff>
--- a/backend/wp_templates/B/B60 总体审计策略及具体审计计划.docx
+++ b/backend/wp_templates/B/B60 总体审计策略及具体审计计划.docx
@@ -4972,56 +4972,9 @@
           <w14:ligatures w14:val="standardContextual"/>
         </w:rPr>
       </w:pPr>
-      <w:hyperlink w:anchor="_Toc153548483" w:history="1">
-        <w:r>
-          <w:rPr>
-            <w:rStyle w:val="ad"/>
-            <w:rFonts w:ascii="Arial Narrow" w:eastAsia="仿宋_GB2312" w:hAnsi="Arial Narrow"/>
-          </w:rPr>
-          <w:t>十三、对审计计划的更新和修改</w:t>
-        </w:r>
-        <w:r>
-          <w:rPr>
-            <w:webHidden/>
-          </w:rPr>
-          <w:tab/>
-        </w:r>
-        <w:r>
-          <w:rPr>
-            <w:webHidden/>
-          </w:rPr>
-          <w:fldChar w:fldCharType="begin"/>
-        </w:r>
-        <w:r>
-          <w:rPr>
-            <w:webHidden/>
-          </w:rPr>
-          <w:instrText xml:space="preserve"> PAGEREF _Toc153548483 \h </w:instrText>
-        </w:r>
-        <w:r>
-          <w:rPr>
-            <w:webHidden/>
-          </w:rPr>
-        </w:r>
-        <w:r>
-          <w:rPr>
-            <w:webHidden/>
-          </w:rPr>
-          <w:fldChar w:fldCharType="separate"/>
-        </w:r>
-        <w:r>
-          <w:rPr>
-            <w:webHidden/>
-          </w:rPr>
-          <w:t>29</w:t>
-        </w:r>
-        <w:r>
-          <w:rPr>
-            <w:webHidden/>
-          </w:rPr>
-          <w:fldChar w:fldCharType="end"/>
-        </w:r>
-      </w:hyperlink>
+      <w:r>
+        <w:t xml:space="preserve">十五、对审计计划的更新和修改	29</w:t>
+      </w:r>
     </w:p>
     <w:p>
       <w:pPr>
@@ -5128,6 +5081,340 @@
       </w:r>
     </w:p>
     <w:p>
+      <w:r>
+        <w:rPr>
+          <w:color w:val="0000FF"/>
+          <w:sz w:val="21"/>
+        </w:rPr>
+        <w:t>〇、附件适用性勾选矩阵（编制正文前先勾选；质控必查）</w:t>
+      </w:r>
+    </w:p>
+    <w:tbl>
+      <w:tblPr>
+        <w:tblStyle w:val="aa"/>
+        <w:tblW w:type="auto" w:w="0"/>
+        <w:tblLook w:firstColumn="1" w:firstRow="1" w:lastColumn="0" w:lastRow="0" w:noHBand="0" w:noVBand="1" w:val="04A0"/>
+      </w:tblPr>
+      <w:tblGrid>
+        <w:gridCol w:w="2254"/>
+        <w:gridCol w:w="2254"/>
+        <w:gridCol w:w="2254"/>
+        <w:gridCol w:w="2254"/>
+      </w:tblGrid>
+      <w:tr>
+        <w:tc>
+          <w:tcPr>
+            <w:tcW w:type="dxa" w:w="2254"/>
+          </w:tcPr>
+          <w:p>
+            <w:r>
+              <w:t>判断项</w:t>
+            </w:r>
+          </w:p>
+        </w:tc>
+        <w:tc>
+          <w:tcPr>
+            <w:tcW w:type="dxa" w:w="2254"/>
+          </w:tcPr>
+          <w:p>
+            <w:r>
+              <w:t>是/否</w:t>
+            </w:r>
+          </w:p>
+        </w:tc>
+        <w:tc>
+          <w:tcPr>
+            <w:tcW w:type="dxa" w:w="2254"/>
+          </w:tcPr>
+          <w:p>
+            <w:r>
+              <w:t>须编制附件</w:t>
+            </w:r>
+          </w:p>
+        </w:tc>
+        <w:tc>
+          <w:tcPr>
+            <w:tcW w:type="dxa" w:w="2254"/>
+          </w:tcPr>
+          <w:p>
+            <w:r>
+              <w:t>备注</w:t>
+            </w:r>
+          </w:p>
+        </w:tc>
+      </w:tr>
+      <w:tr>
+        <w:tc>
+          <w:tcPr>
+            <w:tcW w:type="dxa" w:w="2254"/>
+          </w:tcPr>
+          <w:p>
+            <w:r>
+              <w:t>整合审计 / 仅内控审计</w:t>
+            </w:r>
+          </w:p>
+        </w:tc>
+        <w:tc>
+          <w:tcPr>
+            <w:tcW w:type="dxa" w:w="2254"/>
+          </w:tcPr>
+          <w:p>
+            <w:r/>
+          </w:p>
+        </w:tc>
+        <w:tc>
+          <w:tcPr>
+            <w:tcW w:type="dxa" w:w="2254"/>
+          </w:tcPr>
+          <w:p>
+            <w:r>
+              <w:t>B60A</w:t>
+            </w:r>
+          </w:p>
+        </w:tc>
+        <w:tc>
+          <w:tcPr>
+            <w:tcW w:type="dxa" w:w="2254"/>
+          </w:tcPr>
+          <w:p>
+            <w:r/>
+          </w:p>
+        </w:tc>
+      </w:tr>
+      <w:tr>
+        <w:tc>
+          <w:tcPr>
+            <w:tcW w:type="dxa" w:w="2254"/>
+          </w:tcPr>
+          <w:p>
+            <w:r>
+              <w:t>IPO / 申报财务报表审计</w:t>
+            </w:r>
+          </w:p>
+        </w:tc>
+        <w:tc>
+          <w:tcPr>
+            <w:tcW w:type="dxa" w:w="2254"/>
+          </w:tcPr>
+          <w:p>
+            <w:r/>
+          </w:p>
+        </w:tc>
+        <w:tc>
+          <w:tcPr>
+            <w:tcW w:type="dxa" w:w="2254"/>
+          </w:tcPr>
+          <w:p>
+            <w:r>
+              <w:t>B60B</w:t>
+            </w:r>
+          </w:p>
+        </w:tc>
+        <w:tc>
+          <w:tcPr>
+            <w:tcW w:type="dxa" w:w="2254"/>
+          </w:tcPr>
+          <w:p>
+            <w:r/>
+          </w:p>
+        </w:tc>
+      </w:tr>
+      <w:tr>
+        <w:tc>
+          <w:tcPr>
+            <w:tcW w:type="dxa" w:w="2254"/>
+          </w:tcPr>
+          <w:p>
+            <w:r>
+              <w:t>国有企业年度财务报表审计</w:t>
+            </w:r>
+          </w:p>
+        </w:tc>
+        <w:tc>
+          <w:tcPr>
+            <w:tcW w:type="dxa" w:w="2254"/>
+          </w:tcPr>
+          <w:p>
+            <w:r/>
+          </w:p>
+        </w:tc>
+        <w:tc>
+          <w:tcPr>
+            <w:tcW w:type="dxa" w:w="2254"/>
+          </w:tcPr>
+          <w:p>
+            <w:r>
+              <w:t>B60C</w:t>
+            </w:r>
+          </w:p>
+        </w:tc>
+        <w:tc>
+          <w:tcPr>
+            <w:tcW w:type="dxa" w:w="2254"/>
+          </w:tcPr>
+          <w:p>
+            <w:r/>
+          </w:p>
+        </w:tc>
+      </w:tr>
+      <w:tr>
+        <w:tc>
+          <w:tcPr>
+            <w:tcW w:type="dxa" w:w="2254"/>
+          </w:tcPr>
+          <w:p>
+            <w:r>
+              <w:t>需向证监局等报送审计计划</w:t>
+            </w:r>
+          </w:p>
+        </w:tc>
+        <w:tc>
+          <w:tcPr>
+            <w:tcW w:type="dxa" w:w="2254"/>
+          </w:tcPr>
+          <w:p>
+            <w:r/>
+          </w:p>
+        </w:tc>
+        <w:tc>
+          <w:tcPr>
+            <w:tcW w:type="dxa" w:w="2254"/>
+          </w:tcPr>
+          <w:p>
+            <w:r>
+              <w:t>B60D</w:t>
+            </w:r>
+          </w:p>
+        </w:tc>
+        <w:tc>
+          <w:tcPr>
+            <w:tcW w:type="dxa" w:w="2254"/>
+          </w:tcPr>
+          <w:p>
+            <w:r>
+              <w:t>非集团策略底稿</w:t>
+            </w:r>
+          </w:p>
+        </w:tc>
+      </w:tr>
+      <w:tr>
+        <w:tc>
+          <w:tcPr>
+            <w:tcW w:type="dxa" w:w="2254"/>
+          </w:tcPr>
+          <w:p>
+            <w:r>
+              <w:t>适用 IT 审计（主稿三（六）任一勾选）</w:t>
+            </w:r>
+          </w:p>
+        </w:tc>
+        <w:tc>
+          <w:tcPr>
+            <w:tcW w:type="dxa" w:w="2254"/>
+          </w:tcPr>
+          <w:p>
+            <w:r/>
+          </w:p>
+        </w:tc>
+        <w:tc>
+          <w:tcPr>
+            <w:tcW w:type="dxa" w:w="2254"/>
+          </w:tcPr>
+          <w:p>
+            <w:r>
+              <w:t>B60-2-1；IT团队执行再要2-2、2-3</w:t>
+            </w:r>
+          </w:p>
+        </w:tc>
+        <w:tc>
+          <w:tcPr>
+            <w:tcW w:type="dxa" w:w="2254"/>
+          </w:tcPr>
+          <w:p>
+            <w:r/>
+          </w:p>
+        </w:tc>
+      </w:tr>
+      <w:tr>
+        <w:tc>
+          <w:tcPr>
+            <w:tcW w:type="dxa" w:w="2254"/>
+          </w:tcPr>
+          <w:p>
+            <w:r>
+              <w:t>利用评估（或其他）专家</w:t>
+            </w:r>
+          </w:p>
+        </w:tc>
+        <w:tc>
+          <w:tcPr>
+            <w:tcW w:type="dxa" w:w="2254"/>
+          </w:tcPr>
+          <w:p>
+            <w:r/>
+          </w:p>
+        </w:tc>
+        <w:tc>
+          <w:tcPr>
+            <w:tcW w:type="dxa" w:w="2254"/>
+          </w:tcPr>
+          <w:p>
+            <w:r>
+              <w:t>B60-3</w:t>
+            </w:r>
+          </w:p>
+        </w:tc>
+        <w:tc>
+          <w:tcPr>
+            <w:tcW w:type="dxa" w:w="2254"/>
+          </w:tcPr>
+          <w:p>
+            <w:r/>
+          </w:p>
+        </w:tc>
+      </w:tr>
+      <w:tr>
+        <w:tc>
+          <w:tcPr>
+            <w:tcW w:type="dxa" w:w="2254"/>
+          </w:tcPr>
+          <w:p>
+            <w:r>
+              <w:t>集团且利用组成部分注册会计师</w:t>
+            </w:r>
+          </w:p>
+        </w:tc>
+        <w:tc>
+          <w:tcPr>
+            <w:tcW w:type="dxa" w:w="2254"/>
+          </w:tcPr>
+          <w:p>
+            <w:r/>
+          </w:p>
+        </w:tc>
+        <w:tc>
+          <w:tcPr>
+            <w:tcW w:type="dxa" w:w="2254"/>
+          </w:tcPr>
+          <w:p>
+            <w:r>
+              <w:t>主稿第八章 + B30-2</w:t>
+            </w:r>
+          </w:p>
+        </w:tc>
+        <w:tc>
+          <w:tcPr>
+            <w:tcW w:type="dxa" w:w="2254"/>
+          </w:tcPr>
+          <w:p>
+            <w:r>
+              <w:t>勿用B60D代替</w:t>
+            </w:r>
+          </w:p>
+        </w:tc>
+      </w:tr>
+    </w:tbl>
+    <w:p>
       <w:pPr>
         <w:pStyle w:val="af1"/>
         <w:jc w:val="left"/>
@@ -14694,7 +14981,7 @@
           <w:sz w:val="24"/>
           <w:szCs w:val="24"/>
         </w:rPr>
-        <w:t>详见</w:t>
+        <w:t>详见「B60-1审计项目工时预算与控制表」（索引号统一为B60-1，不再使用B61-1）。</w:t>
       </w:r>
       <w:r>
         <w:rPr>
@@ -14704,7 +14991,6 @@
           <w:sz w:val="24"/>
           <w:szCs w:val="24"/>
         </w:rPr>
-        <w:t>“</w:t>
       </w:r>
       <w:r>
         <w:rPr>
@@ -14715,7 +15001,6 @@
           <w:sz w:val="24"/>
           <w:szCs w:val="24"/>
         </w:rPr>
-        <w:t>B</w:t>
       </w:r>
       <w:r>
         <w:rPr>
@@ -14726,7 +15011,6 @@
           <w:sz w:val="24"/>
           <w:szCs w:val="24"/>
         </w:rPr>
-        <w:t>6</w:t>
       </w:r>
       <w:r>
         <w:rPr>
@@ -14737,7 +15021,6 @@
           <w:sz w:val="24"/>
           <w:szCs w:val="24"/>
         </w:rPr>
-        <w:t>0</w:t>
       </w:r>
       <w:r>
         <w:rPr>
@@ -14748,7 +15031,6 @@
           <w:sz w:val="24"/>
           <w:szCs w:val="24"/>
         </w:rPr>
-        <w:t>-1</w:t>
       </w:r>
       <w:r>
         <w:rPr>
@@ -14759,7 +15041,6 @@
           <w:sz w:val="24"/>
           <w:szCs w:val="24"/>
         </w:rPr>
-        <w:t>审计项目工时预算与控制表</w:t>
       </w:r>
       <w:r>
         <w:rPr>
@@ -14770,7 +15051,6 @@
           <w:sz w:val="24"/>
           <w:szCs w:val="24"/>
         </w:rPr>
-        <w:t>”</w:t>
       </w:r>
       <w:r>
         <w:rPr>
@@ -14780,7 +15060,6 @@
           <w:sz w:val="24"/>
           <w:szCs w:val="24"/>
         </w:rPr>
-        <w:t>。</w:t>
       </w:r>
     </w:p>
     <w:p>
@@ -27922,7 +28201,7 @@
           <w:sz w:val="24"/>
           <w:szCs w:val="24"/>
         </w:rPr>
-        <w:t>重要性水平的确定过程详见</w:t>
+        <w:t>重要性水平结论详见B19-1；计算过程详见B15。</w:t>
       </w:r>
       <w:r>
         <w:rPr>
@@ -27932,7 +28211,6 @@
           <w:sz w:val="24"/>
           <w:szCs w:val="24"/>
         </w:rPr>
-        <w:t>B1</w:t>
       </w:r>
       <w:r>
         <w:rPr>
@@ -27942,7 +28220,6 @@
           <w:sz w:val="24"/>
           <w:szCs w:val="24"/>
         </w:rPr>
-        <w:t>5</w:t>
       </w:r>
       <w:r>
         <w:rPr>
@@ -27951,7 +28228,6 @@
           <w:sz w:val="24"/>
           <w:szCs w:val="24"/>
         </w:rPr>
-        <w:t>。</w:t>
       </w:r>
     </w:p>
     <w:p>
@@ -29682,67 +29958,66 @@
       <w:r>
         <w:rPr>
           <w:rFonts w:ascii="Arial Narrow" w:eastAsia="仿宋_GB2312" w:hAnsi="Arial Narrow" w:hint="eastAsia"/>
-          <w:kern w:val="0"/>
-          <w:sz w:val="24"/>
-          <w:szCs w:val="24"/>
-        </w:rPr>
-        <w:t>风险因素</w:t>
+          <w:color w:val="0000FF"/>
+          <w:kern w:val="0"/>
+          <w:sz w:val="24"/>
+          <w:szCs w:val="24"/>
+        </w:rPr>
+        <w:t>风险因素的确定依据详见B50。【本章仅摘录结论与索引，禁止粘贴B50全文；详细程序与样本量见B30及科目计划。】</w:t>
       </w:r>
       <w:r>
         <w:rPr>
           <w:rFonts w:ascii="Arial Narrow" w:eastAsia="仿宋_GB2312" w:hAnsi="Arial Narrow"/>
-          <w:kern w:val="0"/>
-          <w:sz w:val="24"/>
-          <w:szCs w:val="24"/>
-        </w:rPr>
-        <w:t>的确定</w:t>
+          <w:color w:val="0000FF"/>
+          <w:kern w:val="0"/>
+          <w:sz w:val="24"/>
+          <w:szCs w:val="24"/>
+        </w:rPr>
       </w:r>
       <w:r>
         <w:rPr>
           <w:rFonts w:ascii="Arial Narrow" w:eastAsia="仿宋_GB2312" w:hAnsi="Arial Narrow" w:hint="eastAsia"/>
-          <w:kern w:val="0"/>
-          <w:sz w:val="24"/>
-          <w:szCs w:val="24"/>
-        </w:rPr>
-        <w:t>依据</w:t>
+          <w:color w:val="0000FF"/>
+          <w:kern w:val="0"/>
+          <w:sz w:val="24"/>
+          <w:szCs w:val="24"/>
+        </w:rPr>
       </w:r>
       <w:r>
         <w:rPr>
           <w:rFonts w:ascii="Arial Narrow" w:eastAsia="仿宋_GB2312" w:hAnsi="Arial Narrow"/>
-          <w:kern w:val="0"/>
-          <w:sz w:val="24"/>
-          <w:szCs w:val="24"/>
-        </w:rPr>
-        <w:t>详见</w:t>
+          <w:color w:val="0000FF"/>
+          <w:kern w:val="0"/>
+          <w:sz w:val="24"/>
+          <w:szCs w:val="24"/>
+        </w:rPr>
       </w:r>
       <w:r>
         <w:rPr>
           <w:rFonts w:ascii="Arial Narrow" w:eastAsia="仿宋_GB2312" w:hAnsi="Arial Narrow"/>
-          <w:color w:val="FF0000"/>
-          <w:kern w:val="0"/>
-          <w:sz w:val="24"/>
-          <w:szCs w:val="24"/>
-        </w:rPr>
-        <w:t>B</w:t>
+          <w:color w:val="0000FF"/>
+          <w:kern w:val="0"/>
+          <w:sz w:val="24"/>
+          <w:szCs w:val="24"/>
+        </w:rPr>
       </w:r>
       <w:r>
         <w:rPr>
           <w:rFonts w:ascii="Arial Narrow" w:eastAsia="仿宋_GB2312" w:hAnsi="Arial Narrow" w:hint="eastAsia"/>
-          <w:color w:val="FF0000"/>
-          <w:kern w:val="0"/>
-          <w:sz w:val="24"/>
-          <w:szCs w:val="24"/>
-        </w:rPr>
-        <w:t>50</w:t>
+          <w:color w:val="0000FF"/>
+          <w:kern w:val="0"/>
+          <w:sz w:val="24"/>
+          <w:szCs w:val="24"/>
+        </w:rPr>
       </w:r>
       <w:r>
         <w:rPr>
           <w:rFonts w:ascii="Arial Narrow" w:eastAsia="仿宋_GB2312" w:hAnsi="Arial Narrow"/>
-          <w:kern w:val="0"/>
-          <w:sz w:val="24"/>
-          <w:szCs w:val="24"/>
-        </w:rPr>
-        <w:t>。</w:t>
+          <w:color w:val="0000FF"/>
+          <w:kern w:val="0"/>
+          <w:sz w:val="24"/>
+          <w:szCs w:val="24"/>
+        </w:rPr>
       </w:r>
     </w:p>
     <w:p>
@@ -31649,6 +31924,50 @@
             </w:r>
           </w:p>
         </w:tc>
+        <w:tc>
+          <w:tcPr>
+            <w:tcW w:w="2437" w:type="dxa"/>
+            <w:vAlign w:val="center"/>
+          </w:tcPr>
+          <w:p>
+            <w:r>
+              <w:t xml:space="preserve">循环代码</w:t>
+            </w:r>
+          </w:p>
+        </w:tc>
+        <w:tc>
+          <w:tcPr>
+            <w:tcW w:w="2437" w:type="dxa"/>
+            <w:vAlign w:val="center"/>
+          </w:tcPr>
+          <w:p>
+            <w:r>
+              <w:t xml:space="preserve">拟用程序底稿索引</w:t>
+            </w:r>
+          </w:p>
+        </w:tc>
+        <w:tc>
+          <w:tcPr>
+            <w:tcW w:w="2437" w:type="dxa"/>
+            <w:vAlign w:val="center"/>
+          </w:tcPr>
+          <w:p>
+            <w:r>
+              <w:t xml:space="preserve">是否拟依赖控制</w:t>
+            </w:r>
+          </w:p>
+        </w:tc>
+        <w:tc>
+          <w:tcPr>
+            <w:tcW w:w="2437" w:type="dxa"/>
+            <w:vAlign w:val="center"/>
+          </w:tcPr>
+          <w:p>
+            <w:r>
+              <w:t xml:space="preserve">风险ID/B50行号</w:t>
+            </w:r>
+          </w:p>
+        </w:tc>
       </w:tr>
       <w:tr>
         <w:trPr>
@@ -31744,6 +32063,46 @@
             </w:r>
           </w:p>
         </w:tc>
+        <w:tc>
+          <w:tcPr>
+            <w:tcW w:w="2437" w:type="dxa"/>
+          </w:tcPr>
+          <w:p>
+            <w:r>
+              <w:t xml:space="preserve"/>
+            </w:r>
+          </w:p>
+        </w:tc>
+        <w:tc>
+          <w:tcPr>
+            <w:tcW w:w="2437" w:type="dxa"/>
+          </w:tcPr>
+          <w:p>
+            <w:r>
+              <w:t xml:space="preserve"/>
+            </w:r>
+          </w:p>
+        </w:tc>
+        <w:tc>
+          <w:tcPr>
+            <w:tcW w:w="2437" w:type="dxa"/>
+          </w:tcPr>
+          <w:p>
+            <w:r>
+              <w:t xml:space="preserve"/>
+            </w:r>
+          </w:p>
+        </w:tc>
+        <w:tc>
+          <w:tcPr>
+            <w:tcW w:w="2437" w:type="dxa"/>
+          </w:tcPr>
+          <w:p>
+            <w:r>
+              <w:t xml:space="preserve"/>
+            </w:r>
+          </w:p>
+        </w:tc>
       </w:tr>
       <w:tr>
         <w:trPr>
@@ -31825,6 +32184,46 @@
             </w:r>
           </w:p>
         </w:tc>
+        <w:tc>
+          <w:tcPr>
+            <w:tcW w:w="2437" w:type="dxa"/>
+          </w:tcPr>
+          <w:p>
+            <w:r>
+              <w:t xml:space="preserve"/>
+            </w:r>
+          </w:p>
+        </w:tc>
+        <w:tc>
+          <w:tcPr>
+            <w:tcW w:w="2437" w:type="dxa"/>
+          </w:tcPr>
+          <w:p>
+            <w:r>
+              <w:t xml:space="preserve"/>
+            </w:r>
+          </w:p>
+        </w:tc>
+        <w:tc>
+          <w:tcPr>
+            <w:tcW w:w="2437" w:type="dxa"/>
+          </w:tcPr>
+          <w:p>
+            <w:r>
+              <w:t xml:space="preserve"/>
+            </w:r>
+          </w:p>
+        </w:tc>
+        <w:tc>
+          <w:tcPr>
+            <w:tcW w:w="2437" w:type="dxa"/>
+          </w:tcPr>
+          <w:p>
+            <w:r>
+              <w:t xml:space="preserve"/>
+            </w:r>
+          </w:p>
+        </w:tc>
       </w:tr>
       <w:tr>
         <w:trPr>
@@ -31913,6 +32312,46 @@
             </w:r>
           </w:p>
         </w:tc>
+        <w:tc>
+          <w:tcPr>
+            <w:tcW w:w="2437" w:type="dxa"/>
+          </w:tcPr>
+          <w:p>
+            <w:r>
+              <w:t xml:space="preserve"/>
+            </w:r>
+          </w:p>
+        </w:tc>
+        <w:tc>
+          <w:tcPr>
+            <w:tcW w:w="2437" w:type="dxa"/>
+          </w:tcPr>
+          <w:p>
+            <w:r>
+              <w:t xml:space="preserve"/>
+            </w:r>
+          </w:p>
+        </w:tc>
+        <w:tc>
+          <w:tcPr>
+            <w:tcW w:w="2437" w:type="dxa"/>
+          </w:tcPr>
+          <w:p>
+            <w:r>
+              <w:t xml:space="preserve"/>
+            </w:r>
+          </w:p>
+        </w:tc>
+        <w:tc>
+          <w:tcPr>
+            <w:tcW w:w="2437" w:type="dxa"/>
+          </w:tcPr>
+          <w:p>
+            <w:r>
+              <w:t xml:space="preserve"/>
+            </w:r>
+          </w:p>
+        </w:tc>
       </w:tr>
       <w:tr>
         <w:trPr>
@@ -31987,6 +32426,46 @@
             </w:pPr>
           </w:p>
         </w:tc>
+        <w:tc>
+          <w:tcPr>
+            <w:tcW w:w="2437" w:type="dxa"/>
+          </w:tcPr>
+          <w:p>
+            <w:r>
+              <w:t xml:space="preserve"/>
+            </w:r>
+          </w:p>
+        </w:tc>
+        <w:tc>
+          <w:tcPr>
+            <w:tcW w:w="2437" w:type="dxa"/>
+          </w:tcPr>
+          <w:p>
+            <w:r>
+              <w:t xml:space="preserve"/>
+            </w:r>
+          </w:p>
+        </w:tc>
+        <w:tc>
+          <w:tcPr>
+            <w:tcW w:w="2437" w:type="dxa"/>
+          </w:tcPr>
+          <w:p>
+            <w:r>
+              <w:t xml:space="preserve"/>
+            </w:r>
+          </w:p>
+        </w:tc>
+        <w:tc>
+          <w:tcPr>
+            <w:tcW w:w="2437" w:type="dxa"/>
+          </w:tcPr>
+          <w:p>
+            <w:r>
+              <w:t xml:space="preserve"/>
+            </w:r>
+          </w:p>
+        </w:tc>
       </w:tr>
       <w:tr>
         <w:trPr>
@@ -32054,6 +32533,46 @@
             </w:pPr>
           </w:p>
         </w:tc>
+        <w:tc>
+          <w:tcPr>
+            <w:tcW w:w="2437" w:type="dxa"/>
+          </w:tcPr>
+          <w:p>
+            <w:r>
+              <w:t xml:space="preserve"/>
+            </w:r>
+          </w:p>
+        </w:tc>
+        <w:tc>
+          <w:tcPr>
+            <w:tcW w:w="2437" w:type="dxa"/>
+          </w:tcPr>
+          <w:p>
+            <w:r>
+              <w:t xml:space="preserve"/>
+            </w:r>
+          </w:p>
+        </w:tc>
+        <w:tc>
+          <w:tcPr>
+            <w:tcW w:w="2437" w:type="dxa"/>
+          </w:tcPr>
+          <w:p>
+            <w:r>
+              <w:t xml:space="preserve"/>
+            </w:r>
+          </w:p>
+        </w:tc>
+        <w:tc>
+          <w:tcPr>
+            <w:tcW w:w="2437" w:type="dxa"/>
+          </w:tcPr>
+          <w:p>
+            <w:r>
+              <w:t xml:space="preserve"/>
+            </w:r>
+          </w:p>
+        </w:tc>
       </w:tr>
       <w:tr>
         <w:trPr>
@@ -32112,6 +32631,46 @@
                 <w:color w:val="FF0000"/>
               </w:rPr>
             </w:pPr>
+          </w:p>
+        </w:tc>
+        <w:tc>
+          <w:tcPr>
+            <w:tcW w:w="2437" w:type="dxa"/>
+          </w:tcPr>
+          <w:p>
+            <w:r>
+              <w:t xml:space="preserve"/>
+            </w:r>
+          </w:p>
+        </w:tc>
+        <w:tc>
+          <w:tcPr>
+            <w:tcW w:w="2437" w:type="dxa"/>
+          </w:tcPr>
+          <w:p>
+            <w:r>
+              <w:t xml:space="preserve"/>
+            </w:r>
+          </w:p>
+        </w:tc>
+        <w:tc>
+          <w:tcPr>
+            <w:tcW w:w="2437" w:type="dxa"/>
+          </w:tcPr>
+          <w:p>
+            <w:r>
+              <w:t xml:space="preserve"/>
+            </w:r>
+          </w:p>
+        </w:tc>
+        <w:tc>
+          <w:tcPr>
+            <w:tcW w:w="2437" w:type="dxa"/>
+          </w:tcPr>
+          <w:p>
+            <w:r>
+              <w:t xml:space="preserve"/>
+            </w:r>
           </w:p>
         </w:tc>
       </w:tr>
@@ -32462,6 +33021,39 @@
             </w:r>
           </w:p>
         </w:tc>
+        <w:tc>
+          <w:tcPr>
+            <w:tcW w:w="2694" w:type="dxa"/>
+            <w:vAlign w:val="center"/>
+          </w:tcPr>
+          <w:p>
+            <w:r>
+              <w:t xml:space="preserve">循环代码</w:t>
+            </w:r>
+          </w:p>
+        </w:tc>
+        <w:tc>
+          <w:tcPr>
+            <w:tcW w:w="2694" w:type="dxa"/>
+            <w:vAlign w:val="center"/>
+          </w:tcPr>
+          <w:p>
+            <w:r>
+              <w:t xml:space="preserve">拟用程序底稿索引</w:t>
+            </w:r>
+          </w:p>
+        </w:tc>
+        <w:tc>
+          <w:tcPr>
+            <w:tcW w:w="2694" w:type="dxa"/>
+            <w:vAlign w:val="center"/>
+          </w:tcPr>
+          <w:p>
+            <w:r>
+              <w:t xml:space="preserve">整合审计是否做业务层控制测试</w:t>
+            </w:r>
+          </w:p>
+        </w:tc>
       </w:tr>
       <w:tr>
         <w:trPr>
@@ -32524,6 +33116,36 @@
             </w:r>
           </w:p>
         </w:tc>
+        <w:tc>
+          <w:tcPr>
+            <w:tcW w:w="2694" w:type="dxa"/>
+          </w:tcPr>
+          <w:p>
+            <w:r>
+              <w:t xml:space="preserve"/>
+            </w:r>
+          </w:p>
+        </w:tc>
+        <w:tc>
+          <w:tcPr>
+            <w:tcW w:w="2694" w:type="dxa"/>
+          </w:tcPr>
+          <w:p>
+            <w:r>
+              <w:t xml:space="preserve"/>
+            </w:r>
+          </w:p>
+        </w:tc>
+        <w:tc>
+          <w:tcPr>
+            <w:tcW w:w="2694" w:type="dxa"/>
+          </w:tcPr>
+          <w:p>
+            <w:r>
+              <w:t xml:space="preserve"/>
+            </w:r>
+          </w:p>
+        </w:tc>
       </w:tr>
       <w:tr>
         <w:trPr>
@@ -32593,6 +33215,36 @@
             </w:r>
           </w:p>
         </w:tc>
+        <w:tc>
+          <w:tcPr>
+            <w:tcW w:w="2694" w:type="dxa"/>
+          </w:tcPr>
+          <w:p>
+            <w:r>
+              <w:t xml:space="preserve"/>
+            </w:r>
+          </w:p>
+        </w:tc>
+        <w:tc>
+          <w:tcPr>
+            <w:tcW w:w="2694" w:type="dxa"/>
+          </w:tcPr>
+          <w:p>
+            <w:r>
+              <w:t xml:space="preserve"/>
+            </w:r>
+          </w:p>
+        </w:tc>
+        <w:tc>
+          <w:tcPr>
+            <w:tcW w:w="2694" w:type="dxa"/>
+          </w:tcPr>
+          <w:p>
+            <w:r>
+              <w:t xml:space="preserve"/>
+            </w:r>
+          </w:p>
+        </w:tc>
       </w:tr>
       <w:tr>
         <w:trPr>
@@ -32655,6 +33307,36 @@
             </w:pPr>
           </w:p>
         </w:tc>
+        <w:tc>
+          <w:tcPr>
+            <w:tcW w:w="2694" w:type="dxa"/>
+          </w:tcPr>
+          <w:p>
+            <w:r>
+              <w:t xml:space="preserve"/>
+            </w:r>
+          </w:p>
+        </w:tc>
+        <w:tc>
+          <w:tcPr>
+            <w:tcW w:w="2694" w:type="dxa"/>
+          </w:tcPr>
+          <w:p>
+            <w:r>
+              <w:t xml:space="preserve"/>
+            </w:r>
+          </w:p>
+        </w:tc>
+        <w:tc>
+          <w:tcPr>
+            <w:tcW w:w="2694" w:type="dxa"/>
+          </w:tcPr>
+          <w:p>
+            <w:r>
+              <w:t xml:space="preserve"/>
+            </w:r>
+          </w:p>
+        </w:tc>
       </w:tr>
       <w:tr>
         <w:trPr>
@@ -32698,6 +33380,36 @@
           </w:tcPr>
           <w:p/>
         </w:tc>
+        <w:tc>
+          <w:tcPr>
+            <w:tcW w:w="2694" w:type="dxa"/>
+          </w:tcPr>
+          <w:p>
+            <w:r>
+              <w:t xml:space="preserve"/>
+            </w:r>
+          </w:p>
+        </w:tc>
+        <w:tc>
+          <w:tcPr>
+            <w:tcW w:w="2694" w:type="dxa"/>
+          </w:tcPr>
+          <w:p>
+            <w:r>
+              <w:t xml:space="preserve"/>
+            </w:r>
+          </w:p>
+        </w:tc>
+        <w:tc>
+          <w:tcPr>
+            <w:tcW w:w="2694" w:type="dxa"/>
+          </w:tcPr>
+          <w:p>
+            <w:r>
+              <w:t xml:space="preserve"/>
+            </w:r>
+          </w:p>
+        </w:tc>
       </w:tr>
       <w:tr>
         <w:trPr>
@@ -32741,6 +33453,36 @@
           </w:tcPr>
           <w:p/>
         </w:tc>
+        <w:tc>
+          <w:tcPr>
+            <w:tcW w:w="2694" w:type="dxa"/>
+          </w:tcPr>
+          <w:p>
+            <w:r>
+              <w:t xml:space="preserve"/>
+            </w:r>
+          </w:p>
+        </w:tc>
+        <w:tc>
+          <w:tcPr>
+            <w:tcW w:w="2694" w:type="dxa"/>
+          </w:tcPr>
+          <w:p>
+            <w:r>
+              <w:t xml:space="preserve"/>
+            </w:r>
+          </w:p>
+        </w:tc>
+        <w:tc>
+          <w:tcPr>
+            <w:tcW w:w="2694" w:type="dxa"/>
+          </w:tcPr>
+          <w:p>
+            <w:r>
+              <w:t xml:space="preserve"/>
+            </w:r>
+          </w:p>
+        </w:tc>
       </w:tr>
       <w:tr>
         <w:trPr>
@@ -32776,6 +33518,36 @@
             <w:tcW w:w="2694" w:type="dxa"/>
           </w:tcPr>
           <w:p/>
+        </w:tc>
+        <w:tc>
+          <w:tcPr>
+            <w:tcW w:w="2694" w:type="dxa"/>
+          </w:tcPr>
+          <w:p>
+            <w:r>
+              <w:t xml:space="preserve"/>
+            </w:r>
+          </w:p>
+        </w:tc>
+        <w:tc>
+          <w:tcPr>
+            <w:tcW w:w="2694" w:type="dxa"/>
+          </w:tcPr>
+          <w:p>
+            <w:r>
+              <w:t xml:space="preserve"/>
+            </w:r>
+          </w:p>
+        </w:tc>
+        <w:tc>
+          <w:tcPr>
+            <w:tcW w:w="2694" w:type="dxa"/>
+          </w:tcPr>
+          <w:p>
+            <w:r>
+              <w:t xml:space="preserve"/>
+            </w:r>
+          </w:p>
         </w:tc>
       </w:tr>
     </w:tbl>
@@ -41369,8 +42141,7 @@
           <w:sz w:val="28"/>
           <w:szCs w:val="28"/>
         </w:rPr>
-        <w:lastRenderedPageBreak/>
-        <w:t>十三</w:t>
+        <w:t>十五、对审计计划的更新和修改</w:t>
       </w:r>
       <w:r>
         <w:rPr>
@@ -41378,7 +42149,6 @@
           <w:sz w:val="28"/>
           <w:szCs w:val="28"/>
         </w:rPr>
-        <w:t>、对审计计划</w:t>
       </w:r>
       <w:r>
         <w:rPr>
@@ -41386,7 +42156,6 @@
           <w:sz w:val="28"/>
           <w:szCs w:val="28"/>
         </w:rPr>
-        <w:t>的更新</w:t>
       </w:r>
       <w:bookmarkStart w:id="64" w:name="OLE_LINK1"/>
       <w:r>
@@ -41395,9 +42164,17 @@
           <w:sz w:val="28"/>
           <w:szCs w:val="28"/>
         </w:rPr>
-        <w:t>和修改</w:t>
       </w:r>
       <w:bookmarkEnd w:id="61"/>
+    </w:p>
+    <w:p>
+      <w:r>
+        <w:rPr>
+          <w:color w:val="0000FF"/>
+          <w:sz w:val="21"/>
+        </w:rPr>
+        <w:t>【触发条件勾选】集团安排重大调整 / 重要性重定 / IT或专家安排重大调整 / KAM变化 / 新舞弊迹象或程序重大变化 / 进度重大调整 / 关注函举报或融资退市风险 / 无上述情形（须书面说明本期无重大修改）。修改轮次表应评估：对已执行程序充分性的影响（无需追加 / 需追加—索引 / 需重做—索引）。</w:t>
+      </w:r>
     </w:p>
     <w:bookmarkEnd w:id="62"/>
     <w:bookmarkEnd w:id="63"/>
@@ -43409,6 +44186,15 @@
         </w:tc>
       </w:tr>
     </w:tbl>
+    <w:p>
+      <w:r>
+        <w:rPr>
+          <w:color w:val="0000FF"/>
+          <w:sz w:val="21"/>
+        </w:rPr>
+        <w:t>【填写规则】本底稿为总体审计策略+计划层摘要。风险与应对细节索引B50/B30及各循环程序表，禁止粘贴B50全文；若无增量信息，填「无超出B50的补充」。第七章 SCOT+/仅重大表须填：循环代码、拟用程序底稿索引、是否拟依赖控制、风险ID/B50行号。</w:t>
+      </w:r>
+    </w:p>
     <w:bookmarkEnd w:id="65"/>
     <w:p>
       <w:pPr>
@@ -43632,6 +44418,42 @@
           <w:szCs w:val="24"/>
         </w:rPr>
         <w:t>评估专家工作计划</w:t>
+      </w:r>
+    </w:p>
+    <w:p>
+      <w:r>
+        <w:rPr>
+          <w:color w:val="0000FF"/>
+          <w:sz w:val="21"/>
+        </w:rPr>
+        <w:t>B60A 对内控审计的特殊考虑（条件适用）</w:t>
+      </w:r>
+    </w:p>
+    <w:p>
+      <w:r>
+        <w:rPr>
+          <w:color w:val="0000FF"/>
+          <w:sz w:val="21"/>
+        </w:rPr>
+        <w:t>B60B 对IPO申报财务报表审计的特殊考虑（条件适用）</w:t>
+      </w:r>
+    </w:p>
+    <w:p>
+      <w:r>
+        <w:rPr>
+          <w:color w:val="0000FF"/>
+          <w:sz w:val="21"/>
+        </w:rPr>
+        <w:t>B60C 对国有企业年度财务报表审计的特殊考虑（条件适用）</w:t>
+      </w:r>
+    </w:p>
+    <w:p>
+      <w:r>
+        <w:rPr>
+          <w:color w:val="0000FF"/>
+          <w:sz w:val="21"/>
+        </w:rPr>
+        <w:t>B60D 向监管机构报送总体审计策略和具体审计计划的函副本（条件适用；非集团策略）</w:t>
       </w:r>
     </w:p>
     <w:p>

</xml_diff>